<commit_message>
Registrar zenodo.org DOI y Hacer Alpha Cronbach y Prueba de Hipótesis
</commit_message>
<xml_diff>
--- a/paper_evaluacion_asistida.docx
+++ b/paper_evaluacion_asistida.docx
@@ -4,33 +4,23 @@
   <w:body>
     <w:p>
       <w:pPr>
-        <w:rPr>
-          <w:b/>
-          <w:bCs/>
-        </w:rPr>
-      </w:pPr>
-      <w:r>
-        <w:rPr>
-          <w:b/>
-          <w:bCs/>
-        </w:rPr>
-        <w:t xml:space="preserve">Rediseño de la Evaluación Universitaria mediante Inteligencia Artificial Generativa: Optimización del </w:t>
-      </w:r>
-      <w:proofErr w:type="spellStart"/>
-      <w:r>
-        <w:rPr>
-          <w:b/>
-          <w:bCs/>
-        </w:rPr>
-        <w:t>Feedback</w:t>
-      </w:r>
-      <w:proofErr w:type="spellEnd"/>
-      <w:r>
-        <w:rPr>
-          <w:b/>
-          <w:bCs/>
-        </w:rPr>
-        <w:t xml:space="preserve"> Formativo y Eficiencia Docente en la Enseñanza de Investigación de Mercados</w:t>
+        <w:pStyle w:val="Ttulo1"/>
+      </w:pPr>
+      <w:r>
+        <w:t>Rediseño de la Evaluación Universitaria mediante Inteligencia Artificial Generativa: Optimización del Feedback Formativo y Eficiencia Docente en la Enseñanza de Investigación de Mercados</w:t>
+      </w:r>
+    </w:p>
+    <w:p>
+      <w:r>
+        <w:t xml:space="preserve">DOI: </w:t>
+      </w:r>
+      <w:r>
+        <w:t>10.5281/zenodo.23027579</w:t>
+      </w:r>
+    </w:p>
+    <w:p>
+      <w:r>
+        <w:t>Autor: Carlos Alfaro Díaz</w:t>
       </w:r>
     </w:p>
     <w:p>
@@ -52,7 +42,6 @@
       <w:r>
         <w:t xml:space="preserve">Este estudio analiza la implementación de un modelo de evaluación sumativa y formativa asistido por Inteligencia Artificial Generativa (IAG) utilizando el modelo Gemini en la asignatura de Investigación de Mercados. La experiencia integró la generación automatizada de reactivos de alta complejidad cognitiva, la definición previa de un estándar de respuesta perfecta, y el procesamiento automatizado de informes en formato digital para la entrega de </w:t>
       </w:r>
-      <w:proofErr w:type="spellStart"/>
       <w:r>
         <w:rPr>
           <w:i/>
@@ -60,7 +49,6 @@
         </w:rPr>
         <w:t>feedback</w:t>
       </w:r>
-      <w:proofErr w:type="spellEnd"/>
       <w:r>
         <w:t xml:space="preserve"> cualitativo personalizado. Se evaluó una cohorte de 10 estudiantes mediante 6 preguntas analíticas abiertas. Los resultados muestran una reducción del </w:t>
       </w:r>
@@ -104,7 +92,6 @@
       <w:r>
         <w:t xml:space="preserve">El objetivo de este trabajo es sistematizar y analizar la experiencia de implementación de un flujo de trabajo evaluativo asistido por la plataforma Gemini en un curso universitario de Investigación de Mercados, analizando su impacto en la eficiencia del tiempo docente, la calidad del </w:t>
       </w:r>
-      <w:proofErr w:type="spellStart"/>
       <w:r>
         <w:rPr>
           <w:i/>
@@ -112,7 +99,6 @@
         </w:rPr>
         <w:t>feedback</w:t>
       </w:r>
-      <w:proofErr w:type="spellEnd"/>
       <w:r>
         <w:t xml:space="preserve"> y la redefinición del rol del profesor en el aula.</w:t>
       </w:r>
@@ -134,6 +120,7 @@
     </w:p>
     <w:p>
       <w:r>
+        <w:lastRenderedPageBreak/>
         <w:t>La experiencia se estructuró a través de un flujo de trabajo compuesto por cinco etapas secuenciales, aplicadas sobre una muestra de 10 entregas de estudiantes (</w:t>
       </w:r>
       <m:oMath>
@@ -164,6 +151,11 @@
       </w:r>
     </w:p>
     <w:p>
+      <w:r>
+        <w:t>Existe un trabajo previo en que determina las lecturas a ser revisadas conforme al programa de trabajo, luego se determina los contenidos relevantes por temática a ser medida o evaluada en cuanto a retención a corto plazo máximo 3 semanas.</w:t>
+      </w:r>
+    </w:p>
+    <w:p>
       <w:pPr>
         <w:numPr>
           <w:ilvl w:val="0"/>
@@ -189,7 +181,9 @@
         </w:numPr>
       </w:pPr>
       <w:r>
-        <w:lastRenderedPageBreak/>
+        <w:rPr>
+          <w:noProof/>
+        </w:rPr>
         <w:drawing>
           <wp:anchor distT="0" distB="0" distL="114300" distR="114300" simplePos="0" relativeHeight="251658240" behindDoc="0" locked="0" layoutInCell="1" allowOverlap="1" wp14:anchorId="57B37FEB" wp14:editId="2D2FCFE9">
             <wp:simplePos x="0" y="0"/>
@@ -292,7 +286,6 @@
       <w:r>
         <w:t xml:space="preserve"> El docente ejecutó un </w:t>
       </w:r>
-      <w:proofErr w:type="spellStart"/>
       <w:r>
         <w:rPr>
           <w:i/>
@@ -300,7 +293,6 @@
         </w:rPr>
         <w:t>prompt</w:t>
       </w:r>
-      <w:proofErr w:type="spellEnd"/>
       <w:r>
         <w:t xml:space="preserve"> estandarizado ingresando el estándar de referencia junto con las respuestas de cada estudiante. Gemini comparó cada ítem contra la pauta perfecta, asignó un porcentaje de aproximación a la excelencia por pregunta y redactó una retroalimentación formativa acotada a exactamente 600 caracteres con enfoque constructivo. </w:t>
       </w:r>
@@ -450,6 +442,7 @@
               <w:spacing w:after="160" w:line="278" w:lineRule="auto"/>
             </w:pPr>
             <w:r>
+              <w:lastRenderedPageBreak/>
               <w:t>Diseño de Pauta y Reactivos</w:t>
             </w:r>
           </w:p>
@@ -577,15 +570,7 @@
               <w:spacing w:after="160" w:line="278" w:lineRule="auto"/>
             </w:pPr>
             <w:r>
-              <w:t xml:space="preserve">Redacción de </w:t>
-            </w:r>
-            <w:proofErr w:type="spellStart"/>
-            <w:r>
-              <w:t>Feedback</w:t>
-            </w:r>
-            <w:proofErr w:type="spellEnd"/>
-            <w:r>
-              <w:t xml:space="preserve"> Cualitativo</w:t>
+              <w:t>Redacción de Feedback Cualitativo</w:t>
             </w:r>
           </w:p>
         </w:tc>
@@ -777,7 +762,6 @@
     </w:tbl>
     <w:p>
       <w:r>
-        <w:lastRenderedPageBreak/>
         <w:t xml:space="preserve">El procedimiento optimizado permitió reducir la dedicación docente de una jornada casi completa de revisión a poco más de una hora de trabajo enfocado, representando una </w:t>
       </w:r>
       <w:r>
@@ -853,13 +837,8 @@
               <w:spacing w:after="160" w:line="278" w:lineRule="auto"/>
               <w:cnfStyle w:val="100000000000" w:firstRow="1" w:lastRow="0" w:firstColumn="0" w:lastColumn="0" w:oddVBand="0" w:evenVBand="0" w:oddHBand="0" w:evenHBand="0" w:firstRowFirstColumn="0" w:firstRowLastColumn="0" w:lastRowFirstColumn="0" w:lastRowLastColumn="0"/>
             </w:pPr>
-            <w:proofErr w:type="spellStart"/>
             <w:r>
-              <w:t>Seleccion</w:t>
-            </w:r>
-            <w:proofErr w:type="spellEnd"/>
-            <w:r>
-              <w:t xml:space="preserve"> Múltiple Tradicional</w:t>
+              <w:t>Seleccion Múltiple Tradicional</w:t>
             </w:r>
           </w:p>
         </w:tc>
@@ -939,15 +918,7 @@
               <w:cnfStyle w:val="000000100000" w:firstRow="0" w:lastRow="0" w:firstColumn="0" w:lastColumn="0" w:oddVBand="0" w:evenVBand="0" w:oddHBand="1" w:evenHBand="0" w:firstRowFirstColumn="0" w:firstRowLastColumn="0" w:lastRowFirstColumn="0" w:lastRowLastColumn="0"/>
             </w:pPr>
             <w:r>
-              <w:t>Alta (</w:t>
-            </w:r>
-            <w:proofErr w:type="spellStart"/>
-            <w:r>
-              <w:t>Sintesis</w:t>
-            </w:r>
-            <w:proofErr w:type="spellEnd"/>
-            <w:r>
-              <w:t xml:space="preserve"> y redacción)</w:t>
+              <w:t>Alta (Sintesis y redacción)</w:t>
             </w:r>
           </w:p>
         </w:tc>
@@ -986,13 +957,8 @@
               <w:spacing w:after="160" w:line="278" w:lineRule="auto"/>
             </w:pPr>
             <w:r>
-              <w:t xml:space="preserve">Calidad del </w:t>
+              <w:t>Calidad del Feedback</w:t>
             </w:r>
-            <w:proofErr w:type="spellStart"/>
-            <w:r>
-              <w:t>Feedback</w:t>
-            </w:r>
-            <w:proofErr w:type="spellEnd"/>
           </w:p>
         </w:tc>
         <w:tc>
@@ -1294,10 +1260,28 @@
           <w:b/>
           <w:bCs/>
         </w:rPr>
-        <w:t>promedio general del 89,2% de aproximación a la respuesta perfecta</w:t>
-      </w:r>
-      <w:r>
-        <w:t xml:space="preserve">. El modelo de retroalimentación permitió detectar brechas sutiles pero relevantes, tales como la omisión del concepto de cero absoluto real en la escala de razón ($0), la carga cognitiva en la escala de suma constante o la mención de términos técnicos avanzados como el indicador "alfa si se elimina el ítem". </w:t>
+        <w:t xml:space="preserve">promedio general del 89,2% </w:t>
+      </w:r>
+      <w:r>
+        <w:rPr>
+          <w:b/>
+          <w:bCs/>
+        </w:rPr>
+        <w:t xml:space="preserve">(6.4) </w:t>
+      </w:r>
+      <w:r>
+        <w:rPr>
+          <w:b/>
+          <w:bCs/>
+        </w:rPr>
+        <w:t>de aproximación a la respuesta perfecta</w:t>
+      </w:r>
+      <w:r>
+        <w:t xml:space="preserve">. El modelo de retroalimentación permitió detectar brechas sutiles pero relevantes, tales como la omisión </w:t>
+      </w:r>
+      <w:r>
+        <w:lastRenderedPageBreak/>
+        <w:t xml:space="preserve">del concepto de cero absoluto real en la escala de razón ($0), la carga cognitiva en la escala de suma constante o la mención de términos técnicos avanzados como el indicador "alfa si se elimina el ítem". </w:t>
       </w:r>
     </w:p>
     <w:p>
@@ -1381,7 +1365,6 @@
           <w:b/>
           <w:bCs/>
         </w:rPr>
-        <w:lastRenderedPageBreak/>
         <w:t>5. Pasos Futuros y Recomendaciones Post-Paper</w:t>
       </w:r>
     </w:p>
@@ -1402,28 +1385,11 @@
           <w:b/>
           <w:bCs/>
         </w:rPr>
-        <w:t xml:space="preserve">Automatización de la Escala de Calificación en el </w:t>
-      </w:r>
-      <w:proofErr w:type="spellStart"/>
-      <w:r>
-        <w:rPr>
-          <w:b/>
-          <w:bCs/>
-        </w:rPr>
-        <w:t>Prompt</w:t>
-      </w:r>
-      <w:proofErr w:type="spellEnd"/>
-      <w:r>
-        <w:rPr>
-          <w:b/>
-          <w:bCs/>
-        </w:rPr>
-        <w:t>:</w:t>
+        <w:t>Automatización de la Escala de Calificación en el Prompt:</w:t>
       </w:r>
       <w:r>
         <w:t xml:space="preserve"> Modificar el </w:t>
       </w:r>
-      <w:proofErr w:type="spellStart"/>
       <w:r>
         <w:rPr>
           <w:i/>
@@ -1431,7 +1397,6 @@
         </w:rPr>
         <w:t>prompt</w:t>
       </w:r>
-      <w:proofErr w:type="spellEnd"/>
       <w:r>
         <w:t xml:space="preserve"> de evaluación para incorporar directamente la fórmula de conversión del porcentaje de logro a la escala de calificaciones chilena (1,0 a 7,0 con exigencia al 60%), eliminando la necesidad de cálculo manual por parte del docente.</w:t>
       </w:r>
@@ -1512,15 +1477,7 @@
         <w:t>scripts</w:t>
       </w:r>
       <w:r>
-        <w:t xml:space="preserve"> o integraciones que permitan la lectura directa de los archivos cargados en plataformas como Moodle o </w:t>
-      </w:r>
-      <w:proofErr w:type="spellStart"/>
-      <w:r>
-        <w:t>Canvas</w:t>
-      </w:r>
-      <w:proofErr w:type="spellEnd"/>
-      <w:r>
-        <w:t xml:space="preserve"> y el envío automatizado de las retroalimentaciones, reduciendo la manipulación manual de archivos.</w:t>
+        <w:t xml:space="preserve"> o integraciones que permitan la lectura directa de los archivos cargados en plataformas como Moodle o Canvas y el envío automatizado de las retroalimentaciones, reduciendo la manipulación manual de archivos.</w:t>
       </w:r>
     </w:p>
     <w:p>
@@ -1537,7 +1494,6 @@
         </w:rPr>
         <w:t xml:space="preserve">Validación del </w:t>
       </w:r>
-      <w:proofErr w:type="spellStart"/>
       <w:r>
         <w:rPr>
           <w:b/>
@@ -1547,7 +1503,6 @@
         </w:rPr>
         <w:t>Feedback</w:t>
       </w:r>
-      <w:proofErr w:type="spellEnd"/>
       <w:r>
         <w:rPr>
           <w:b/>
@@ -1564,6 +1519,7 @@
         <w:pStyle w:val="Ttulo1"/>
       </w:pPr>
       <w:r>
+        <w:lastRenderedPageBreak/>
         <w:t>Estudio de la Percepción del estudiante ante la Evaluación Asistida por IAG</w:t>
       </w:r>
     </w:p>
@@ -1622,23 +1578,7 @@
           <w:b/>
           <w:bCs/>
         </w:rPr>
-        <w:t xml:space="preserve">1. Utilidad Percibida del </w:t>
-      </w:r>
-      <w:proofErr w:type="spellStart"/>
-      <w:r>
-        <w:rPr>
-          <w:b/>
-          <w:bCs/>
-        </w:rPr>
-        <w:t>Feedback</w:t>
-      </w:r>
-      <w:proofErr w:type="spellEnd"/>
-      <w:r>
-        <w:rPr>
-          <w:b/>
-          <w:bCs/>
-        </w:rPr>
-        <w:t xml:space="preserve"> Formativo (</w:t>
+        <w:t>1. Utilidad Percibida del Feedback Formativo (</w:t>
       </w:r>
       <w:r>
         <w:rPr>
@@ -1718,19 +1658,10 @@
           <w:b/>
           <w:bCs/>
         </w:rPr>
-        <w:lastRenderedPageBreak/>
         <w:t>Definición:</w:t>
       </w:r>
       <w:r>
-        <w:t xml:space="preserve"> Percepción sobre la objetividad, consistencia, imparcialidad y apego al </w:t>
-      </w:r>
-      <w:proofErr w:type="spellStart"/>
-      <w:r>
-        <w:t>pautaje</w:t>
-      </w:r>
-      <w:proofErr w:type="spellEnd"/>
-      <w:r>
-        <w:t>/estándar de la corrección realizada por el sistema en comparación con la revisión humana tradicional.</w:t>
+        <w:t xml:space="preserve"> Percepción sobre la objetividad, consistencia, imparcialidad y apego al pautaje/estándar de la corrección realizada por el sistema en comparación con la revisión humana tradicional.</w:t>
       </w:r>
     </w:p>
     <w:p>
@@ -1924,6 +1855,7 @@
         <w:pStyle w:val="Ttulo2"/>
       </w:pPr>
       <w:r>
+        <w:lastRenderedPageBreak/>
         <w:t>CUESTIONARIO DE PERCEPCIÓN SOBRE EL PROCESO EVALUATIVO ASISTIDO POR IA (PEA-IA)</w:t>
       </w:r>
     </w:p>
@@ -1960,21 +1892,7 @@
           <w:b/>
           <w:bCs/>
         </w:rPr>
-        <w:t xml:space="preserve">de los </w:t>
-      </w:r>
-      <w:r>
-        <w:rPr>
-          <w:b/>
-          <w:bCs/>
-        </w:rPr>
-        <w:t>sí</w:t>
-      </w:r>
-      <w:r>
-        <w:rPr>
-          <w:b/>
-          <w:bCs/>
-        </w:rPr>
-        <w:t xml:space="preserve"> evaluados</w:t>
+        <w:t>de los sí evaluados</w:t>
       </w:r>
       <w:r>
         <w:rPr>
@@ -2037,13 +1955,8 @@
           <w:numId w:val="9"/>
         </w:numPr>
       </w:pPr>
-      <w:proofErr w:type="gramStart"/>
-      <w:r>
-        <w:t>[ ]</w:t>
-      </w:r>
-      <w:proofErr w:type="gramEnd"/>
-      <w:r>
-        <w:t xml:space="preserve"> </w:t>
+      <w:r>
+        <w:t xml:space="preserve">[ ] </w:t>
       </w:r>
       <w:r>
         <w:rPr>
@@ -2081,13 +1994,8 @@
           <w:numId w:val="9"/>
         </w:numPr>
       </w:pPr>
-      <w:proofErr w:type="gramStart"/>
-      <w:r>
-        <w:t>[ ]</w:t>
-      </w:r>
-      <w:proofErr w:type="gramEnd"/>
-      <w:r>
-        <w:t xml:space="preserve"> </w:t>
+      <w:r>
+        <w:t xml:space="preserve">[ ] </w:t>
       </w:r>
       <w:r>
         <w:rPr>
@@ -2154,7 +2062,6 @@
           <w:b/>
           <w:bCs/>
         </w:rPr>
-        <w:lastRenderedPageBreak/>
         <w:t>1</w:t>
       </w:r>
       <w:r>
@@ -2245,23 +2152,7 @@
           <w:b/>
           <w:bCs/>
         </w:rPr>
-        <w:t xml:space="preserve">DIMENSIÓN 1: Utilidad Percibida del </w:t>
-      </w:r>
-      <w:proofErr w:type="spellStart"/>
-      <w:r>
-        <w:rPr>
-          <w:b/>
-          <w:bCs/>
-        </w:rPr>
-        <w:t>Feedback</w:t>
-      </w:r>
-      <w:proofErr w:type="spellEnd"/>
-      <w:r>
-        <w:rPr>
-          <w:b/>
-          <w:bCs/>
-        </w:rPr>
-        <w:t xml:space="preserve"> Formativo</w:t>
+        <w:t>DIMENSIÓN 1: Utilidad Percibida del Feedback Formativo</w:t>
       </w:r>
     </w:p>
     <w:p>
@@ -2294,15 +2185,7 @@
         </w:numPr>
       </w:pPr>
       <w:r>
-        <w:t xml:space="preserve">El </w:t>
-      </w:r>
-      <w:proofErr w:type="spellStart"/>
-      <w:r>
-        <w:t>feedback</w:t>
-      </w:r>
-      <w:proofErr w:type="spellEnd"/>
-      <w:r>
-        <w:t xml:space="preserve"> que recibí aporta más a mi aprendizaje que solo haber conocido la nota final numérica.</w:t>
+        <w:t>El feedback que recibí aporta más a mi aprendizaje que solo haber conocido la nota final numérica.</w:t>
       </w:r>
     </w:p>
     <w:p>
@@ -2350,6 +2233,7 @@
         </w:numPr>
       </w:pPr>
       <w:r>
+        <w:lastRenderedPageBreak/>
         <w:t>La pauta de "Respuesta Perfecta" me pareció un criterio claro y transparente para juzgar el desempeño.</w:t>
       </w:r>
     </w:p>
@@ -2475,7 +2359,6 @@
           <w:b/>
           <w:bCs/>
         </w:rPr>
-        <w:lastRenderedPageBreak/>
         <w:t>DIMENSIÓN 5: Aceptación y Confianza en el Modelo</w:t>
       </w:r>
     </w:p>
@@ -2546,7 +2429,21 @@
           <w:b/>
           <w:bCs/>
         </w:rPr>
-        <w:t>1. Dimensión Expectativa Formativa y Operativa</w:t>
+        <w:t xml:space="preserve">1. Dimensión </w:t>
+      </w:r>
+      <w:r>
+        <w:rPr>
+          <w:b/>
+          <w:bCs/>
+        </w:rPr>
+        <w:t xml:space="preserve">Previa </w:t>
+      </w:r>
+      <w:r>
+        <w:rPr>
+          <w:b/>
+          <w:bCs/>
+        </w:rPr>
+        <w:t>Expectativa Formativa y Operativa</w:t>
       </w:r>
     </w:p>
     <w:p>
@@ -2591,7 +2488,21 @@
           <w:b/>
           <w:bCs/>
         </w:rPr>
-        <w:t>2. Dimensión Percepción del Rol y Compromiso Docente (Explora el sesgo previo/menosprecio)</w:t>
+        <w:t xml:space="preserve">2. Dimensión Percepción </w:t>
+      </w:r>
+      <w:r>
+        <w:rPr>
+          <w:b/>
+          <w:bCs/>
+        </w:rPr>
+        <w:t xml:space="preserve">previa </w:t>
+      </w:r>
+      <w:r>
+        <w:rPr>
+          <w:b/>
+          <w:bCs/>
+        </w:rPr>
+        <w:t>del Rol y Compromiso Docente (Explora el sesgo previo/menosprecio)</w:t>
       </w:r>
     </w:p>
     <w:p>
@@ -2606,6 +2517,7 @@
           <w:b/>
           <w:bCs/>
         </w:rPr>
+        <w:lastRenderedPageBreak/>
         <w:t>EB.3:</w:t>
       </w:r>
       <w:r>
@@ -2900,15 +2812,7 @@
         <w:t>Tipo de Escala:</w:t>
       </w:r>
       <w:r>
-        <w:t xml:space="preserve"> Escala de Tipo Likert de 5 puntos, no comparativa, </w:t>
-      </w:r>
-      <w:proofErr w:type="spellStart"/>
-      <w:r>
-        <w:t>itemizada</w:t>
-      </w:r>
-      <w:proofErr w:type="spellEnd"/>
-      <w:r>
-        <w:t xml:space="preserve"> e impar.</w:t>
+        <w:t xml:space="preserve"> Escala de Tipo Likert de 5 puntos, no comparativa, itemizada e impar.</w:t>
       </w:r>
     </w:p>
     <w:p>
@@ -2923,6 +2827,7 @@
           <w:b/>
           <w:bCs/>
         </w:rPr>
+        <w:lastRenderedPageBreak/>
         <w:t>Estructura de Opciones:</w:t>
       </w:r>
       <w:r>
@@ -2966,23 +2871,7 @@
           <w:b/>
           <w:bCs/>
         </w:rPr>
-        <w:t xml:space="preserve">Dimensión 1 (Utilidad del </w:t>
-      </w:r>
-      <w:proofErr w:type="spellStart"/>
-      <w:r>
-        <w:rPr>
-          <w:b/>
-          <w:bCs/>
-        </w:rPr>
-        <w:t>Feedback</w:t>
-      </w:r>
-      <w:proofErr w:type="spellEnd"/>
-      <w:r>
-        <w:rPr>
-          <w:b/>
-          <w:bCs/>
-        </w:rPr>
-        <w:t xml:space="preserve"> Formativo):</w:t>
+        <w:t>Dimensión 1 (Utilidad del Feedback Formativo):</w:t>
       </w:r>
       <w:r>
         <w:t xml:space="preserve"> 3 ítems directos.</w:t>
@@ -3083,23 +2972,7 @@
         </w:numPr>
       </w:pPr>
       <w:r>
-        <w:t xml:space="preserve">Cuestionario autoadministrado en formato digital (Google </w:t>
-      </w:r>
-      <w:proofErr w:type="spellStart"/>
-      <w:r>
-        <w:t>Forms</w:t>
-      </w:r>
-      <w:proofErr w:type="spellEnd"/>
-      <w:r>
-        <w:t xml:space="preserve">, Microsoft </w:t>
-      </w:r>
-      <w:proofErr w:type="spellStart"/>
-      <w:r>
-        <w:t>Forms</w:t>
-      </w:r>
-      <w:proofErr w:type="spellEnd"/>
-      <w:r>
-        <w:t xml:space="preserve"> o encuesta adjunta).</w:t>
+        <w:t>Cuestionario autoadministrado en formato digital (Google Forms, o encuesta adjunta).</w:t>
       </w:r>
     </w:p>
     <w:p>
@@ -3161,7 +3034,6 @@
           <w:b/>
           <w:bCs/>
         </w:rPr>
-        <w:lastRenderedPageBreak/>
         <w:t>Dimensión 3 (Disposición y Confianza Futura):</w:t>
       </w:r>
       <w:r>
@@ -3276,6 +3148,7 @@
         <w:pStyle w:val="Ttulo1"/>
       </w:pPr>
       <w:r>
+        <w:lastRenderedPageBreak/>
         <w:t>Resultados de la aplicación del cuestionario</w:t>
       </w:r>
     </w:p>
@@ -7034,6 +6907,36 @@
       </w:tcPr>
     </w:tblStylePr>
   </w:style>
+  <w:style w:type="paragraph" w:styleId="HTMLconformatoprevio">
+    <w:name w:val="HTML Preformatted"/>
+    <w:basedOn w:val="Normal"/>
+    <w:link w:val="HTMLconformatoprevioCar"/>
+    <w:uiPriority w:val="99"/>
+    <w:semiHidden/>
+    <w:unhideWhenUsed/>
+    <w:rsid w:val="00B70B98"/>
+    <w:pPr>
+      <w:spacing w:after="0" w:line="240" w:lineRule="auto"/>
+    </w:pPr>
+    <w:rPr>
+      <w:rFonts w:ascii="Consolas" w:hAnsi="Consolas"/>
+      <w:sz w:val="20"/>
+      <w:szCs w:val="20"/>
+    </w:rPr>
+  </w:style>
+  <w:style w:type="character" w:customStyle="1" w:styleId="HTMLconformatoprevioCar">
+    <w:name w:val="HTML con formato previo Car"/>
+    <w:basedOn w:val="Fuentedeprrafopredeter"/>
+    <w:link w:val="HTMLconformatoprevio"/>
+    <w:uiPriority w:val="99"/>
+    <w:semiHidden/>
+    <w:rsid w:val="00B70B98"/>
+    <w:rPr>
+      <w:rFonts w:ascii="Consolas" w:hAnsi="Consolas"/>
+      <w:sz w:val="20"/>
+      <w:szCs w:val="20"/>
+    </w:rPr>
+  </w:style>
 </w:styles>
 </file>
 

</xml_diff>